<commit_message>
Docs v2.18.0 — sound item type, override_data duration (speaker+sound), payer real name, DocAutoCalc fixes
Co-Authored-By: Claude Sonnet 4.6 <noreply@anthropic.com>
</commit_message>
<xml_diff>
--- a/web/templates/receipts/body-1/sound.docx
+++ b/web/templates/receipts/body-1/sound.docx
@@ -122,7 +122,7 @@
           <w:rFonts w:cs="TH Sarabun New" w:ascii="TH Sarabun New" w:hAnsi="TH Sarabun New"/>
           <w:sz w:val="28"/>
         </w:rPr>
-        <w:t>{{event_date}}</w:t>
+        <w:t xml:space="preserve">{{event_date}} </w:t>
       </w:r>
       <w:r>
         <w:rPr>
@@ -130,7 +130,7 @@
           <w:sz w:val="28"/>
           <w:sz w:val="28"/>
         </w:rPr>
-        <w:t>จำนวนวันหรือชั่วโมง ที่เช่าเครื่องเสียง</w:t>
+        <w:t xml:space="preserve">จำนวนวันหรือชั่วโมง ที่เช่าเครื่องเสียง </w:t>
       </w:r>
       <w:r>
         <w:rPr>
@@ -170,14 +170,14 @@
           <w:sz w:val="28"/>
           <w:sz w:val="28"/>
         </w:rPr>
-        <w:t xml:space="preserve">ชั่วโมง ละ </w:t>
+        <w:t>ชั่วโมง ละ …</w:t>
       </w:r>
       <w:r>
         <w:rPr>
           <w:rFonts w:cs="TH Sarabun New" w:ascii="TH Sarabun New" w:hAnsi="TH Sarabun New"/>
           <w:sz w:val="28"/>
         </w:rPr>
-        <w:t>{{unit_price}}</w:t>
+        <w:t xml:space="preserve">. {{unit_price}} …. </w:t>
       </w:r>
       <w:r>
         <w:rPr>
@@ -210,7 +210,15 @@
           <w:rFonts w:cs="TH Sarabun New" w:ascii="TH Sarabun New" w:hAnsi="TH Sarabun New"/>
           <w:sz w:val="28"/>
         </w:rPr>
-        <w:t>3 ** {{participant_count}}</w:t>
+        <w:t xml:space="preserve">3 ** {{participant_count}} </w:t>
+      </w:r>
+      <w:r>
+        <w:rPr>
+          <w:rFonts w:ascii="TH Sarabun New" w:hAnsi="TH Sarabun New" w:cs="TH Sarabun New"/>
+          <w:sz w:val="28"/>
+          <w:sz w:val="28"/>
+        </w:rPr>
+        <w:t>คน</w:t>
       </w:r>
     </w:p>
     <w:p>
@@ -983,10 +991,7 @@
         </w:rPr>
       </w:pPr>
       <w:r>
-        <w:rPr>
-          <w:rFonts w:cs="TH Sarabun New" w:ascii="TH Sarabun New" w:hAnsi="TH Sarabun New"/>
-          <w:sz w:val="28"/>
-        </w:rPr>
+        <w:rPr/>
       </w:r>
     </w:p>
     <w:sectPr>

</xml_diff>